<commit_message>
feat: Mamin — tambah Daftar Hadir (form + preview dari data Guru/Tendik)
</commit_message>
<xml_diff>
--- a/template/Daftar Hadir.docx
+++ b/template/Daftar Hadir.docx
@@ -1213,6 +1213,19 @@
               </w:rPr>
               <w:t>Kepala Sekolah</w:t>
             </w:r>
+            <w:r>
+              <w:t xml:space="preserve"> </w:t>
+            </w:r>
+          </w:p>
+          <w:p>
+            <w:r>
+              <w:t xml:space="preserve">SD Negeri </w:t>
+            </w:r>
+            <w:proofErr w:type="spellStart"/>
+            <w:r>
+              <w:t>Lebakleungsir</w:t>
+            </w:r>
+            <w:proofErr w:type="spellEnd"/>
           </w:p>
           <w:p>
             <w:pPr>
@@ -1385,6 +1398,322 @@
   <w:p>
     <w:pPr>
       <w:pStyle w:val="Header"/>
+      <w:jc w:val="center"/>
+      <w:rPr>
+        <w:rFonts w:ascii="Microsoft PhagsPa" w:hAnsi="Microsoft PhagsPa"/>
+        <w:b/>
+        <w:szCs w:val="24"/>
+      </w:rPr>
+    </w:pPr>
+    <w:bookmarkStart w:id="0" w:name="_Hlk94858181"/>
+    <w:bookmarkStart w:id="1" w:name="_Hlk94858182"/>
+    <w:r>
+      <w:rPr>
+        <w:rFonts w:ascii="Microsoft PhagsPa" w:hAnsi="Microsoft PhagsPa"/>
+        <w:b/>
+        <w:noProof/>
+        <w:szCs w:val="24"/>
+      </w:rPr>
+      <w:drawing>
+        <wp:anchor distT="0" distB="0" distL="114300" distR="114300" simplePos="0" relativeHeight="251663360" behindDoc="0" locked="0" layoutInCell="1" allowOverlap="1" wp14:anchorId="0BA7177F" wp14:editId="1ED3145A">
+          <wp:simplePos x="0" y="0"/>
+          <wp:positionH relativeFrom="column">
+            <wp:posOffset>3810</wp:posOffset>
+          </wp:positionH>
+          <wp:positionV relativeFrom="paragraph">
+            <wp:posOffset>-1905</wp:posOffset>
+          </wp:positionV>
+          <wp:extent cx="792480" cy="742290"/>
+          <wp:effectExtent l="0" t="0" r="7620" b="1270"/>
+          <wp:wrapNone/>
+          <wp:docPr id="8" name="Picture 8"/>
+          <wp:cNvGraphicFramePr>
+            <a:graphicFrameLocks xmlns:a="http://schemas.openxmlformats.org/drawingml/2006/main" noChangeAspect="1"/>
+          </wp:cNvGraphicFramePr>
+          <a:graphic xmlns:a="http://schemas.openxmlformats.org/drawingml/2006/main">
+            <a:graphicData uri="http://schemas.openxmlformats.org/drawingml/2006/picture">
+              <pic:pic xmlns:pic="http://schemas.openxmlformats.org/drawingml/2006/picture">
+                <pic:nvPicPr>
+                  <pic:cNvPr id="8" name="Picture 8"/>
+                  <pic:cNvPicPr/>
+                </pic:nvPicPr>
+                <pic:blipFill>
+                  <a:blip r:embed="rId1" cstate="print">
+                    <a:extLst>
+                      <a:ext uri="{28A0092B-C50C-407E-A947-70E740481C1C}">
+                        <a14:useLocalDpi xmlns:a14="http://schemas.microsoft.com/office/drawing/2010/main" val="0"/>
+                      </a:ext>
+                    </a:extLst>
+                  </a:blip>
+                  <a:stretch>
+                    <a:fillRect/>
+                  </a:stretch>
+                </pic:blipFill>
+                <pic:spPr>
+                  <a:xfrm>
+                    <a:off x="0" y="0"/>
+                    <a:ext cx="796855" cy="746388"/>
+                  </a:xfrm>
+                  <a:prstGeom prst="rect">
+                    <a:avLst/>
+                  </a:prstGeom>
+                </pic:spPr>
+              </pic:pic>
+            </a:graphicData>
+          </a:graphic>
+          <wp14:sizeRelH relativeFrom="page">
+            <wp14:pctWidth>0</wp14:pctWidth>
+          </wp14:sizeRelH>
+          <wp14:sizeRelV relativeFrom="page">
+            <wp14:pctHeight>0</wp14:pctHeight>
+          </wp14:sizeRelV>
+        </wp:anchor>
+      </w:drawing>
+    </w:r>
+    <w:r>
+      <w:rPr>
+        <w:rFonts w:ascii="Microsoft PhagsPa" w:hAnsi="Microsoft PhagsPa"/>
+        <w:b/>
+        <w:szCs w:val="24"/>
+      </w:rPr>
+      <w:t>PEMERINTAH KABUPATEN BANDUNG BARAT</w:t>
+    </w:r>
+  </w:p>
+  <w:p>
+    <w:pPr>
+      <w:pStyle w:val="Header"/>
+      <w:jc w:val="center"/>
+      <w:rPr>
+        <w:rFonts w:ascii="Microsoft PhagsPa" w:hAnsi="Microsoft PhagsPa"/>
+        <w:b/>
+        <w:szCs w:val="24"/>
+      </w:rPr>
+    </w:pPr>
+    <w:r>
+      <w:rPr>
+        <w:rFonts w:ascii="Microsoft PhagsPa" w:hAnsi="Microsoft PhagsPa"/>
+        <w:b/>
+        <w:szCs w:val="24"/>
+      </w:rPr>
+      <w:t>DINAS PENDIDIKAN</w:t>
+    </w:r>
+  </w:p>
+  <w:p>
+    <w:pPr>
+      <w:pStyle w:val="Header"/>
+      <w:jc w:val="center"/>
+      <w:rPr>
+        <w:rFonts w:ascii="Microsoft PhagsPa" w:hAnsi="Microsoft PhagsPa"/>
+        <w:b/>
+        <w:szCs w:val="24"/>
+      </w:rPr>
+    </w:pPr>
+    <w:r>
+      <w:rPr>
+        <w:rFonts w:ascii="Microsoft PhagsPa" w:hAnsi="Microsoft PhagsPa"/>
+        <w:b/>
+        <w:szCs w:val="24"/>
+      </w:rPr>
+      <w:t>SD NEGERI LEBAKLEUNGSIR</w:t>
+    </w:r>
+  </w:p>
+  <w:p>
+    <w:pPr>
+      <w:pStyle w:val="Header"/>
+      <w:jc w:val="center"/>
+      <w:rPr>
+        <w:rFonts w:ascii="Microsoft PhagsPa" w:hAnsi="Microsoft PhagsPa"/>
+        <w:b/>
+        <w:sz w:val="26"/>
+        <w:szCs w:val="26"/>
+      </w:rPr>
+    </w:pPr>
+    <w:r>
+      <w:rPr>
+        <w:rFonts w:ascii="Microsoft PhagsPa" w:hAnsi="Microsoft PhagsPa"/>
+        <w:b/>
+        <w:sz w:val="26"/>
+        <w:szCs w:val="26"/>
+      </w:rPr>
+      <w:t>KECAMATAN CIKALONGWETAN</w:t>
+    </w:r>
+  </w:p>
+  <w:p>
+    <w:pPr>
+      <w:pStyle w:val="Header"/>
+      <w:jc w:val="center"/>
+      <w:rPr>
+        <w:rFonts w:ascii="Microsoft PhagsPa" w:hAnsi="Microsoft PhagsPa"/>
+        <w:sz w:val="18"/>
+        <w:szCs w:val="14"/>
+      </w:rPr>
+    </w:pPr>
+    <w:proofErr w:type="spellStart"/>
+    <w:r>
+      <w:rPr>
+        <w:rFonts w:ascii="Microsoft PhagsPa" w:hAnsi="Microsoft PhagsPa"/>
+        <w:sz w:val="18"/>
+        <w:szCs w:val="14"/>
+      </w:rPr>
+      <w:t>Kp</w:t>
+    </w:r>
+    <w:proofErr w:type="spellEnd"/>
+    <w:r>
+      <w:rPr>
+        <w:rFonts w:ascii="Microsoft PhagsPa" w:hAnsi="Microsoft PhagsPa"/>
+        <w:sz w:val="18"/>
+        <w:szCs w:val="14"/>
+      </w:rPr>
+      <w:t xml:space="preserve">. </w:t>
+    </w:r>
+    <w:proofErr w:type="spellStart"/>
+    <w:r>
+      <w:rPr>
+        <w:rFonts w:ascii="Microsoft PhagsPa" w:hAnsi="Microsoft PhagsPa"/>
+        <w:sz w:val="18"/>
+        <w:szCs w:val="14"/>
+      </w:rPr>
+      <w:t>Warung</w:t>
+    </w:r>
+    <w:proofErr w:type="spellEnd"/>
+    <w:r>
+      <w:rPr>
+        <w:rFonts w:ascii="Microsoft PhagsPa" w:hAnsi="Microsoft PhagsPa"/>
+        <w:sz w:val="18"/>
+        <w:szCs w:val="14"/>
+      </w:rPr>
+      <w:t xml:space="preserve"> </w:t>
+    </w:r>
+    <w:proofErr w:type="spellStart"/>
+    <w:proofErr w:type="gramStart"/>
+    <w:r>
+      <w:rPr>
+        <w:rFonts w:ascii="Microsoft PhagsPa" w:hAnsi="Microsoft PhagsPa"/>
+        <w:sz w:val="18"/>
+        <w:szCs w:val="14"/>
+      </w:rPr>
+      <w:t>domba</w:t>
+    </w:r>
+    <w:proofErr w:type="spellEnd"/>
+    <w:r>
+      <w:rPr>
+        <w:rFonts w:ascii="Microsoft PhagsPa" w:hAnsi="Microsoft PhagsPa"/>
+        <w:sz w:val="18"/>
+        <w:szCs w:val="14"/>
+      </w:rPr>
+      <w:t xml:space="preserve">  RT.</w:t>
+    </w:r>
+    <w:proofErr w:type="gramEnd"/>
+    <w:r>
+      <w:rPr>
+        <w:rFonts w:ascii="Microsoft PhagsPa" w:hAnsi="Microsoft PhagsPa"/>
+        <w:sz w:val="18"/>
+        <w:szCs w:val="14"/>
+      </w:rPr>
+      <w:t xml:space="preserve"> 01 / RW 01 </w:t>
+    </w:r>
+    <w:proofErr w:type="spellStart"/>
+    <w:r>
+      <w:rPr>
+        <w:rFonts w:ascii="Microsoft PhagsPa" w:hAnsi="Microsoft PhagsPa"/>
+        <w:sz w:val="18"/>
+        <w:szCs w:val="14"/>
+      </w:rPr>
+      <w:t>Desa</w:t>
+    </w:r>
+    <w:proofErr w:type="spellEnd"/>
+    <w:r>
+      <w:rPr>
+        <w:rFonts w:ascii="Microsoft PhagsPa" w:hAnsi="Microsoft PhagsPa"/>
+        <w:sz w:val="18"/>
+        <w:szCs w:val="14"/>
+      </w:rPr>
+      <w:t xml:space="preserve">. </w:t>
+    </w:r>
+    <w:proofErr w:type="spellStart"/>
+    <w:r>
+      <w:rPr>
+        <w:rFonts w:ascii="Microsoft PhagsPa" w:hAnsi="Microsoft PhagsPa"/>
+        <w:sz w:val="18"/>
+        <w:szCs w:val="14"/>
+      </w:rPr>
+      <w:t>Mandalamukti</w:t>
+    </w:r>
+    <w:proofErr w:type="spellEnd"/>
+    <w:r>
+      <w:rPr>
+        <w:rFonts w:ascii="Microsoft PhagsPa" w:hAnsi="Microsoft PhagsPa"/>
+        <w:sz w:val="18"/>
+        <w:szCs w:val="14"/>
+      </w:rPr>
+      <w:t xml:space="preserve"> </w:t>
+    </w:r>
+    <w:proofErr w:type="spellStart"/>
+    <w:r>
+      <w:rPr>
+        <w:rFonts w:ascii="Microsoft PhagsPa" w:hAnsi="Microsoft PhagsPa"/>
+        <w:sz w:val="18"/>
+        <w:szCs w:val="14"/>
+      </w:rPr>
+      <w:t>Kec</w:t>
+    </w:r>
+    <w:r>
+      <w:rPr>
+        <w:rFonts w:ascii="Microsoft PhagsPa" w:hAnsi="Microsoft PhagsPa"/>
+        <w:sz w:val="18"/>
+        <w:szCs w:val="14"/>
+      </w:rPr>
+      <w:t>amatan</w:t>
+    </w:r>
+    <w:proofErr w:type="spellEnd"/>
+    <w:r>
+      <w:rPr>
+        <w:rFonts w:ascii="Microsoft PhagsPa" w:hAnsi="Microsoft PhagsPa"/>
+        <w:sz w:val="18"/>
+        <w:szCs w:val="14"/>
+      </w:rPr>
+      <w:t xml:space="preserve"> </w:t>
+    </w:r>
+    <w:proofErr w:type="spellStart"/>
+    <w:r>
+      <w:rPr>
+        <w:rFonts w:ascii="Microsoft PhagsPa" w:hAnsi="Microsoft PhagsPa"/>
+        <w:sz w:val="18"/>
+        <w:szCs w:val="14"/>
+      </w:rPr>
+      <w:t>Cikalongwetan</w:t>
+    </w:r>
+    <w:proofErr w:type="spellEnd"/>
+    <w:r>
+      <w:rPr>
+        <w:rFonts w:ascii="Microsoft PhagsPa" w:hAnsi="Microsoft PhagsPa"/>
+        <w:sz w:val="18"/>
+        <w:szCs w:val="14"/>
+      </w:rPr>
+      <w:t xml:space="preserve"> </w:t>
+    </w:r>
+    <w:proofErr w:type="spellStart"/>
+    <w:r>
+      <w:rPr>
+        <w:rFonts w:ascii="Microsoft PhagsPa" w:hAnsi="Microsoft PhagsPa"/>
+        <w:sz w:val="18"/>
+        <w:szCs w:val="14"/>
+      </w:rPr>
+      <w:t>Kabupaten</w:t>
+    </w:r>
+    <w:proofErr w:type="spellEnd"/>
+    <w:r>
+      <w:rPr>
+        <w:rFonts w:ascii="Microsoft PhagsPa" w:hAnsi="Microsoft PhagsPa"/>
+        <w:sz w:val="18"/>
+        <w:szCs w:val="14"/>
+      </w:rPr>
+      <w:t xml:space="preserve"> Bandung Barat</w:t>
+    </w:r>
+  </w:p>
+  <w:p>
+    <w:pPr>
+      <w:pStyle w:val="Header"/>
     </w:pPr>
     <w:r>
       <w:rPr>
@@ -1393,399 +1722,68 @@
       <mc:AlternateContent>
         <mc:Choice Requires="wps">
           <w:drawing>
-            <wp:anchor distT="0" distB="0" distL="114300" distR="114300" simplePos="0" relativeHeight="251661312" behindDoc="0" locked="0" layoutInCell="1" allowOverlap="1" wp14:anchorId="76D97493" wp14:editId="5A083266">
+            <wp:anchor distT="0" distB="0" distL="114300" distR="114300" simplePos="0" relativeHeight="251664384" behindDoc="0" locked="0" layoutInCell="1" allowOverlap="1" wp14:anchorId="55AAC171" wp14:editId="12CBE239">
               <wp:simplePos x="0" y="0"/>
-              <wp:positionH relativeFrom="margin">
-                <wp:posOffset>-131445</wp:posOffset>
+              <wp:positionH relativeFrom="column">
+                <wp:posOffset>46355</wp:posOffset>
               </wp:positionH>
               <wp:positionV relativeFrom="paragraph">
-                <wp:posOffset>1106805</wp:posOffset>
+                <wp:posOffset>58258</wp:posOffset>
               </wp:positionV>
-              <wp:extent cx="6381750" cy="19050"/>
-              <wp:effectExtent l="0" t="19050" r="19050" b="19050"/>
+              <wp:extent cx="6400800" cy="0"/>
+              <wp:effectExtent l="38100" t="38100" r="57150" b="95250"/>
               <wp:wrapNone/>
-              <wp:docPr id="1" name="Straight Connector 1"/>
-              <wp:cNvGraphicFramePr>
-                <a:graphicFrameLocks xmlns:a="http://schemas.openxmlformats.org/drawingml/2006/main"/>
-              </wp:cNvGraphicFramePr>
+              <wp:docPr id="11" name="Straight Connector 11"/>
+              <wp:cNvGraphicFramePr/>
               <a:graphic xmlns:a="http://schemas.openxmlformats.org/drawingml/2006/main">
                 <a:graphicData uri="http://schemas.microsoft.com/office/word/2010/wordprocessingShape">
                   <wps:wsp>
-                    <wps:cNvCnPr>
-                      <a:cxnSpLocks noChangeShapeType="1"/>
-                    </wps:cNvCnPr>
-                    <wps:spPr bwMode="auto">
-                      <a:xfrm flipV="1">
+                    <wps:cNvCnPr/>
+                    <wps:spPr>
+                      <a:xfrm>
                         <a:off x="0" y="0"/>
-                        <a:ext cx="6381750" cy="19050"/>
+                        <a:ext cx="6400800" cy="0"/>
                       </a:xfrm>
                       <a:prstGeom prst="line">
                         <a:avLst/>
                       </a:prstGeom>
-                      <a:noFill/>
-                      <a:ln w="50800" cmpd="thickThin">
-                        <a:solidFill>
-                          <a:srgbClr val="000000"/>
-                        </a:solidFill>
-                        <a:round/>
-                        <a:headEnd/>
-                        <a:tailEnd/>
-                      </a:ln>
+                      <a:ln w="19050"/>
                     </wps:spPr>
+                    <wps:style>
+                      <a:lnRef idx="2">
+                        <a:schemeClr val="dk1"/>
+                      </a:lnRef>
+                      <a:fillRef idx="0">
+                        <a:schemeClr val="dk1"/>
+                      </a:fillRef>
+                      <a:effectRef idx="1">
+                        <a:schemeClr val="dk1"/>
+                      </a:effectRef>
+                      <a:fontRef idx="minor">
+                        <a:schemeClr val="tx1"/>
+                      </a:fontRef>
+                    </wps:style>
                     <wps:bodyPr/>
                   </wps:wsp>
                 </a:graphicData>
               </a:graphic>
-              <wp14:sizeRelH relativeFrom="page">
+              <wp14:sizeRelH relativeFrom="margin">
                 <wp14:pctWidth>0</wp14:pctWidth>
               </wp14:sizeRelH>
-              <wp14:sizeRelV relativeFrom="page">
-                <wp14:pctHeight>0</wp14:pctHeight>
-              </wp14:sizeRelV>
             </wp:anchor>
           </w:drawing>
         </mc:Choice>
-        <mc:Fallback xmlns:w16du="http://schemas.microsoft.com/office/word/2023/wordml/word16du">
+        <mc:Fallback>
           <w:pict>
-            <v:line w14:anchorId="51BCA05C" id="Straight Connector 1" o:spid="_x0000_s1026" style="position:absolute;flip:y;z-index:251661312;visibility:visible;mso-wrap-style:square;mso-width-percent:0;mso-height-percent:0;mso-wrap-distance-left:9pt;mso-wrap-distance-top:0;mso-wrap-distance-right:9pt;mso-wrap-distance-bottom:0;mso-position-horizontal:absolute;mso-position-horizontal-relative:margin;mso-position-vertical:absolute;mso-position-vertical-relative:text;mso-width-percent:0;mso-height-percent:0;mso-width-relative:page;mso-height-relative:page" from="-10.35pt,87.15pt" to="492.15pt,88.65pt" o:gfxdata="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" strokeweight="4pt">
-              <v:stroke linestyle="thickThin"/>
-              <w10:wrap anchorx="margin"/>
+            <v:line w14:anchorId="08E94088" id="Straight Connector 11" o:spid="_x0000_s1026" style="position:absolute;z-index:251664384;visibility:visible;mso-wrap-style:square;mso-width-percent:0;mso-wrap-distance-left:9pt;mso-wrap-distance-top:0;mso-wrap-distance-right:9pt;mso-wrap-distance-bottom:0;mso-position-horizontal:absolute;mso-position-horizontal-relative:text;mso-position-vertical:absolute;mso-position-vertical-relative:text;mso-width-percent:0;mso-width-relative:margin" from="3.65pt,4.6pt" to="507.65pt,4.6pt" o:gfxdata="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" strokecolor="black [3200]" strokeweight="1.5pt">
+              <v:shadow on="t" color="black" opacity="24903f" origin=",.5" offset="0,.55556mm"/>
             </v:line>
           </w:pict>
         </mc:Fallback>
       </mc:AlternateContent>
     </w:r>
-  </w:p>
-  <w:tbl>
-    <w:tblPr>
-      <w:tblStyle w:val="TableGrid"/>
-      <w:tblpPr w:leftFromText="180" w:rightFromText="180" w:vertAnchor="text" w:horzAnchor="margin" w:tblpXSpec="center" w:tblpY="-383"/>
-      <w:tblW w:w="12165" w:type="dxa"/>
-      <w:tblBorders>
-        <w:top w:val="none" w:sz="0" w:space="0" w:color="auto"/>
-        <w:left w:val="none" w:sz="0" w:space="0" w:color="auto"/>
-        <w:bottom w:val="none" w:sz="0" w:space="0" w:color="auto"/>
-        <w:right w:val="none" w:sz="0" w:space="0" w:color="auto"/>
-        <w:insideH w:val="none" w:sz="0" w:space="0" w:color="auto"/>
-        <w:insideV w:val="none" w:sz="0" w:space="0" w:color="auto"/>
-      </w:tblBorders>
-      <w:tblLayout w:type="fixed"/>
-      <w:tblLook w:val="04A0" w:firstRow="1" w:lastRow="0" w:firstColumn="1" w:lastColumn="0" w:noHBand="0" w:noVBand="1"/>
-    </w:tblPr>
-    <w:tblGrid>
-      <w:gridCol w:w="1985"/>
-      <w:gridCol w:w="8819"/>
-      <w:gridCol w:w="1361"/>
-    </w:tblGrid>
-    <w:tr>
-      <w:trPr>
-        <w:trHeight w:val="1531"/>
-      </w:trPr>
-      <w:tc>
-        <w:tcPr>
-          <w:tcW w:w="1985" w:type="dxa"/>
-          <w:hideMark/>
-        </w:tcPr>
-        <w:p>
-          <w:pPr>
-            <w:rPr>
-              <w:b/>
-            </w:rPr>
-          </w:pPr>
-          <w:r>
-            <w:rPr>
-              <w:noProof/>
-            </w:rPr>
-            <w:drawing>
-              <wp:anchor distT="0" distB="0" distL="114300" distR="114300" simplePos="0" relativeHeight="251657216" behindDoc="0" locked="0" layoutInCell="1" allowOverlap="1" wp14:anchorId="07A34DDF" wp14:editId="1EEF1A90">
-                <wp:simplePos x="0" y="0"/>
-                <wp:positionH relativeFrom="margin">
-                  <wp:posOffset>657860</wp:posOffset>
-                </wp:positionH>
-                <wp:positionV relativeFrom="margin">
-                  <wp:posOffset>-6985</wp:posOffset>
-                </wp:positionV>
-                <wp:extent cx="911225" cy="876300"/>
-                <wp:effectExtent l="0" t="0" r="3175" b="0"/>
-                <wp:wrapNone/>
-                <wp:docPr id="18" name="Picture 18" descr="Kabupaten_Bandung_Barat"/>
-                <wp:cNvGraphicFramePr>
-                  <a:graphicFrameLocks xmlns:a="http://schemas.openxmlformats.org/drawingml/2006/main" noChangeAspect="1"/>
-                </wp:cNvGraphicFramePr>
-                <a:graphic xmlns:a="http://schemas.openxmlformats.org/drawingml/2006/main">
-                  <a:graphicData uri="http://schemas.openxmlformats.org/drawingml/2006/picture">
-                    <pic:pic xmlns:pic="http://schemas.openxmlformats.org/drawingml/2006/picture">
-                      <pic:nvPicPr>
-                        <pic:cNvPr id="0" name="Picture 13" descr="Kabupaten_Bandung_Barat"/>
-                        <pic:cNvPicPr>
-                          <a:picLocks noChangeAspect="1" noChangeArrowheads="1"/>
-                        </pic:cNvPicPr>
-                      </pic:nvPicPr>
-                      <pic:blipFill>
-                        <a:blip r:embed="rId1" cstate="print">
-                          <a:extLst>
-                            <a:ext uri="{28A0092B-C50C-407E-A947-70E740481C1C}">
-                              <a14:useLocalDpi xmlns:a14="http://schemas.microsoft.com/office/drawing/2010/main" val="0"/>
-                            </a:ext>
-                          </a:extLst>
-                        </a:blip>
-                        <a:srcRect/>
-                        <a:stretch>
-                          <a:fillRect/>
-                        </a:stretch>
-                      </pic:blipFill>
-                      <pic:spPr bwMode="auto">
-                        <a:xfrm>
-                          <a:off x="0" y="0"/>
-                          <a:ext cx="911225" cy="876300"/>
-                        </a:xfrm>
-                        <a:prstGeom prst="rect">
-                          <a:avLst/>
-                        </a:prstGeom>
-                        <a:noFill/>
-                      </pic:spPr>
-                    </pic:pic>
-                  </a:graphicData>
-                </a:graphic>
-                <wp14:sizeRelH relativeFrom="margin">
-                  <wp14:pctWidth>0</wp14:pctWidth>
-                </wp14:sizeRelH>
-                <wp14:sizeRelV relativeFrom="margin">
-                  <wp14:pctHeight>0</wp14:pctHeight>
-                </wp14:sizeRelV>
-              </wp:anchor>
-            </w:drawing>
-          </w:r>
-        </w:p>
-      </w:tc>
-      <w:tc>
-        <w:tcPr>
-          <w:tcW w:w="8819" w:type="dxa"/>
-          <w:vAlign w:val="center"/>
-          <w:hideMark/>
-        </w:tcPr>
-        <w:p>
-          <w:pPr>
-            <w:ind w:left="317"/>
-            <w:jc w:val="center"/>
-            <w:rPr>
-              <w:rFonts w:ascii="Arial" w:hAnsi="Arial" w:cs="Arial"/>
-            </w:rPr>
-          </w:pPr>
-          <w:r>
-            <w:rPr>
-              <w:rFonts w:ascii="Arial" w:hAnsi="Arial" w:cs="Arial"/>
-            </w:rPr>
-            <w:t>PEMERINTAH KABUPATEN BANDUNG BARAT</w:t>
-          </w:r>
-        </w:p>
-        <w:p>
-          <w:pPr>
-            <w:ind w:left="317"/>
-            <w:jc w:val="center"/>
-            <w:rPr>
-              <w:rFonts w:ascii="Arial" w:hAnsi="Arial" w:cs="Arial"/>
-              <w:b/>
-              <w:sz w:val="26"/>
-              <w:szCs w:val="26"/>
-              <w:lang w:val="id-ID"/>
-            </w:rPr>
-          </w:pPr>
-          <w:r>
-            <w:rPr>
-              <w:rFonts w:ascii="Arial" w:hAnsi="Arial" w:cs="Arial"/>
-              <w:b/>
-              <w:sz w:val="26"/>
-              <w:szCs w:val="26"/>
-            </w:rPr>
-            <w:t>SD NEGERI PASIRHALANG</w:t>
-          </w:r>
-          <w:r>
-            <w:rPr>
-              <w:rFonts w:ascii="Arial" w:hAnsi="Arial" w:cs="Arial"/>
-              <w:b/>
-              <w:sz w:val="26"/>
-              <w:szCs w:val="26"/>
-              <w:lang w:val="id-ID"/>
-            </w:rPr>
-            <w:t xml:space="preserve"> KECAMATAN CIKALONGWETAN</w:t>
-          </w:r>
-        </w:p>
-        <w:p>
-          <w:pPr>
-            <w:ind w:left="317"/>
-            <w:jc w:val="center"/>
-            <w:rPr>
-              <w:rFonts w:ascii="Arial" w:hAnsi="Arial" w:cs="Arial"/>
-              <w:b/>
-              <w:sz w:val="26"/>
-              <w:szCs w:val="26"/>
-              <w:lang w:val="id-ID"/>
-            </w:rPr>
-          </w:pPr>
-          <w:r>
-            <w:rPr>
-              <w:rFonts w:ascii="Arial" w:hAnsi="Arial" w:cs="Arial"/>
-              <w:b/>
-              <w:sz w:val="26"/>
-              <w:szCs w:val="26"/>
-              <w:lang w:val="id-ID"/>
-            </w:rPr>
-            <w:t>DINAS PENDIDIKAN</w:t>
-          </w:r>
-        </w:p>
-        <w:p>
-          <w:pPr>
-            <w:ind w:left="317"/>
-            <w:jc w:val="center"/>
-            <w:rPr>
-              <w:i/>
-              <w:sz w:val="18"/>
-            </w:rPr>
-          </w:pPr>
-          <w:proofErr w:type="spellStart"/>
-          <w:proofErr w:type="gramStart"/>
-          <w:r>
-            <w:rPr>
-              <w:i/>
-              <w:sz w:val="18"/>
-            </w:rPr>
-            <w:t>Kp.Pasirhalang</w:t>
-          </w:r>
-          <w:proofErr w:type="spellEnd"/>
-          <w:proofErr w:type="gramEnd"/>
-          <w:r>
-            <w:rPr>
-              <w:i/>
-              <w:sz w:val="18"/>
-            </w:rPr>
-            <w:t xml:space="preserve"> Rt.03 Rw.14 Ds. </w:t>
-          </w:r>
-          <w:proofErr w:type="spellStart"/>
-          <w:r>
-            <w:rPr>
-              <w:i/>
-              <w:sz w:val="18"/>
-            </w:rPr>
-            <w:t>Mandalamukti</w:t>
-          </w:r>
-          <w:proofErr w:type="spellEnd"/>
-          <w:r>
-            <w:rPr>
-              <w:i/>
-              <w:sz w:val="18"/>
-            </w:rPr>
-            <w:t xml:space="preserve"> </w:t>
-          </w:r>
-          <w:proofErr w:type="spellStart"/>
-          <w:r>
-            <w:rPr>
-              <w:i/>
-              <w:sz w:val="18"/>
-            </w:rPr>
-            <w:t>Kec</w:t>
-          </w:r>
-          <w:proofErr w:type="spellEnd"/>
-          <w:r>
-            <w:rPr>
-              <w:i/>
-              <w:sz w:val="18"/>
-            </w:rPr>
-            <w:t xml:space="preserve">. </w:t>
-          </w:r>
-          <w:proofErr w:type="spellStart"/>
-          <w:r>
-            <w:rPr>
-              <w:i/>
-              <w:sz w:val="18"/>
-            </w:rPr>
-            <w:t>Cikalongwetan</w:t>
-          </w:r>
-          <w:proofErr w:type="spellEnd"/>
-          <w:r>
-            <w:rPr>
-              <w:i/>
-              <w:sz w:val="18"/>
-            </w:rPr>
-            <w:t xml:space="preserve"> </w:t>
-          </w:r>
-          <w:proofErr w:type="spellStart"/>
-          <w:r>
-            <w:rPr>
-              <w:i/>
-              <w:sz w:val="18"/>
-            </w:rPr>
-            <w:t>Kab</w:t>
-          </w:r>
-          <w:proofErr w:type="spellEnd"/>
-          <w:r>
-            <w:rPr>
-              <w:i/>
-              <w:sz w:val="18"/>
-            </w:rPr>
-            <w:t>. Bandung Barat 40556</w:t>
-          </w:r>
-        </w:p>
-        <w:p>
-          <w:pPr>
-            <w:ind w:left="317"/>
-            <w:jc w:val="center"/>
-            <w:rPr>
-              <w:b/>
-            </w:rPr>
-          </w:pPr>
-          <w:r>
-            <w:rPr>
-              <w:i/>
-              <w:sz w:val="18"/>
-            </w:rPr>
-            <w:t xml:space="preserve">Email: </w:t>
-          </w:r>
-          <w:hyperlink r:id="rId2" w:history="1">
-            <w:r>
-              <w:rPr>
-                <w:rStyle w:val="Hyperlink"/>
-                <w:i/>
-                <w:sz w:val="18"/>
-              </w:rPr>
-              <w:t>Sdnpasirhalang.cikalongwetan@yahoo.co.id</w:t>
-            </w:r>
-          </w:hyperlink>
-        </w:p>
-      </w:tc>
-      <w:tc>
-        <w:tcPr>
-          <w:tcW w:w="1361" w:type="dxa"/>
-        </w:tcPr>
-        <w:p>
-          <w:pPr>
-            <w:jc w:val="center"/>
-            <w:rPr>
-              <w:b/>
-            </w:rPr>
-          </w:pPr>
-        </w:p>
-      </w:tc>
-    </w:tr>
-  </w:tbl>
-  <w:p>
-    <w:pPr>
-      <w:pStyle w:val="BodyText"/>
-      <w:spacing w:before="3"/>
-      <w:rPr>
-        <w:sz w:val="8"/>
-      </w:rPr>
-    </w:pPr>
-  </w:p>
-  <w:p>
-    <w:pPr>
-      <w:pStyle w:val="Header"/>
-    </w:pPr>
-  </w:p>
-  <w:p>
-    <w:pPr>
-      <w:pStyle w:val="Header"/>
-    </w:pPr>
+    <w:bookmarkEnd w:id="0"/>
+    <w:bookmarkEnd w:id="1"/>
   </w:p>
 </w:hdr>
 </file>

</xml_diff>